<commit_message>
Deuteronomy 2nd re-audit: 4 MSG omissions restored (EN/KO), GDocs 34/34 verified
</commit_message>
<xml_diff>
--- a/gdocs_build/Deuteronomy.docx
+++ b/gdocs_build/Deuteronomy.docx
@@ -976,7 +976,7 @@
               <w:rPr>
                 <w:sz w:val="18"/>
               </w:rPr>
-              <w:t>But then you guys totally refused to go up. You rebelled against God's clear command. You complained in your tents: "God hates us. He dragged us out of Egypt just to hand us over to the Amorites to be destroyed. It's a death sentence! How can we possibly go up there? We're trapped. Our own brothers made us lose all our nerve, telling us, 'The people there are bigger and stronger than us, their cities are huge with insane defenses—we even saw giants there!'"</w:t>
+              <w:t>But then you guys totally refused to go up. You rebelled against God's clear command. You complained in your tents: "God hates us. He dragged us out of Egypt just to hand us over to the Amorites to be destroyed. It's a death sentence! How can we possibly go up there? We're trapped. Our own brothers made us lose all our nerve, telling us, 'The people there are bigger and stronger than us, their cities are huge with insane defenses—we even saw Anakite giants there!'"</w:t>
             </w:r>
           </w:p>
         </w:tc>
@@ -2108,7 +2108,7 @@
               <w:rPr>
                 <w:sz w:val="18"/>
               </w:rPr>
-              <w:t>When the last of these fighting men had died, God said to me, “Today you are to cross the border of Moab at Ar. When you get near the Ammonites, don’t bother them or start a fight with them, because I’m not giving you any of their land. I’ve already given it to the descendants of Lot as their possession.” That area is also considered the land of the Rephaites, who used to live there. The Ammonites called them Zamzummites—a strong and numerous people, as tall as the Anakites. God destroyed them, and the Ammonites moved in and took their place. It was the same for the descendants of Esau who live in Seir—God destroyed the Horites who lived there before them, and they took their place, as you can see today. As for the Avvites who lived in villages as far as Gaza, the Caphtorites from Crete wiped them out and settled in their place.</w:t>
+              <w:t>When the last of these fighting men had died, God said to me, “Today you are to cross the border of Moab at Ar. When you get near the Ammonites, don’t bother them or start a fight with them, because I’m not giving you any of their land. I’ve already given it to the descendants of Lot as their possession.” That area is also considered the land of the Rephaites, who used to live there. The Ammonites called them Zamzummites—a strong and numerous people, as tall as the Anakites. God destroyed them, and the Ammonites moved in and took their place. It was the same for the descendants of Esau who live in Seir—God destroyed the Horites who lived there before them, and they took their place, as you can see today. As for the Avvites who lived in villages as far as Gaza, the Caphtorites who came from Caphtor (that's Crete) wiped them out and settled in their place.</w:t>
             </w:r>
           </w:p>
         </w:tc>
@@ -2131,7 +2131,7 @@
               <w:rPr>
                 <w:sz w:val="18"/>
               </w:rPr>
-              <w:t>그 군인들이 마지막 한 명까지 다 죽고 나니까, 하나님이 나한테 말씀하셨어. “오늘 너네는 모압 영토인 아르를 지나갈 거다. 암몬 자손한테 가까이 가거든, 걔네를 괴롭히거나 싸우지 마라. 내가 걔네 땅은 너네한테 안 줄 거거든. 이미 롯 자손한테 줬어.” 거기도 옛날에는 르바임 족속의 땅으로 여겨졌대. 르바임 족속이 옛날에 거기 살았는데, 암몬 사람들은 걔네를 삼숨밈 사람이라고 불렀어. 아낙 자손처럼 키가 크고 힘센 거인들이었지. 하나님이 걔네를 멸망시키고 암몬 사람들이 들어와서 그 땅을 차지했대. 세일에 사는 에서 자손도 마찬가지였어. 하나님이 거기 살던 호리 사람들을 없애버리고, 걔네가 들어와서 그 땅을 차지했지. 너네가 보는 그대로야. 가사까지 여러 마을에 살던 아위 사람들은, 그레데에서 온 갑돌 사람들이 걔네를 싹 쓸어버리고 들어와서 살았대.</w:t>
+              <w:t>그 군인들이 마지막 한 명까지 다 죽고 나니까, 하나님이 나한테 말씀하셨어. “오늘 너네는 모압 영토인 아르를 지나갈 거다. 암몬 자손한테 가까이 가거든, 걔네를 괴롭히거나 싸우지 마라. 내가 걔네 땅은 너네한테 안 줄 거거든. 이미 롯 자손한테 줬어.” 거기도 옛날에는 르바임 족속의 땅으로 여겨졌대. 르바임 족속이 옛날에 거기 살았는데, 암몬 사람들은 걔네를 삼숨밈 사람이라고 불렀어. 아낙 자손처럼 키가 크고 힘센 거인들이었지. 하나님이 걔네를 멸망시키고 암몬 사람들이 들어와서 그 땅을 차지했대. 세일에 사는 에서 자손도 마찬가지였어. 하나님이 거기 살던 호리 사람들을 없애버리고, 걔네가 들어와서 그 땅을 차지했지. 너네가 보는 그대로야. 가사까지 여러 마을에 살던 아위 사람들은, 갑돌(그레데)에서 온 갑돌 사람들이 걔네를 싹 쓸어버리고 들어와서 살았대.</w:t>
             </w:r>
           </w:p>
         </w:tc>
@@ -2885,7 +2885,7 @@
               <w:rPr>
                 <w:sz w:val="18"/>
               </w:rPr>
-              <w:t>So God, our God, handed Og king of Bashan over to us—Og and all his people. we utterly crushed them. No survivors. We also captured all his cities at the same time. Out of sixty cities, we didn't miss a single one. We took the entire region of Argob, which was Og's kingdom in Bashan. These were all fortress cities with massive walls and locked gates. There were also a bunch of smaller villages without walls. We totally destroyed them—a holy destruction. It was the same treatment we gave to Sihon king of Heshbon—a holy destruction of every city, man, woman, and child. But we kept all the animals and the loot from the cities for ourselves.</w:t>
+              <w:t>So God, our God, handed Og king of Bashan over to us—Og and all his people. We utterly crushed them. No survivors. We also captured all his cities at the same time. Out of sixty cities, we didn't miss a single one. We took the entire region of Argob, which was Og's kingdom in Bashan. These were all fortress cities with massive walls and locked gates. There were also a bunch of smaller villages without walls. We totally destroyed them—a holy destruction. It was the same treatment we gave to Sihon king of Heshbon—a holy destruction of every city, man, woman, and child. But we kept all the animals and the loot from the cities for ourselves.</w:t>
             </w:r>
           </w:p>
         </w:tc>
@@ -21650,7 +21650,7 @@
               <w:rPr>
                 <w:sz w:val="18"/>
               </w:rPr>
-              <w:t>Heads up! If there's an outbreak of a serious skin disease, you have to follow the rules the priests lay down, like, to the letter. Follow them precisely as I commanded them. And don't forget what God, your God, did to Miriam when you guys were leaving Egypt.</w:t>
+              <w:t>Heads up! If there's an outbreak of a serious skin disease, you have to follow the rules the Levitical priests lay down, to the letter. Follow them precisely as I commanded them. And don't forget what God, your God, did to Miriam when you guys were leaving Egypt.</w:t>
             </w:r>
           </w:p>
         </w:tc>
@@ -28520,7 +28520,7 @@
               <w:rPr>
                 <w:sz w:val="18"/>
               </w:rPr>
-              <w:t>I'm not making this Covenant and its oath with you alone, but with you who are standing with us here today in the Presence of God, our God, and also with those who are not here with us today. You know what it was like in Egypt and how we crossed through the nations. You experienced their heartless gods, their idols of wood and stone, of silver and gold. Don't let down your guard lest even now, today, someone—man or woman, clan or tribe—gets sidetracked from God, our God, and gets involved with those pagan gods, lest some poisonous weed sprout and spread among you, a person who hears the words of the Covenant-oath and invites himself to the party, congratulating himself, 'I'm one of the good guys—nothing bad is going to happen to me!' Such self-deception will bring a total ruin on him. God will not let him off the hook. God's anger and jealousy will erupt like a volcano against that person. The curses written in this book will bury him. God will blot out his name from the records. God will separate him out from all the tribes of Israel for special punishment, according to all the curses of the Covenant written in this Book of the Revelation.</w:t>
+              <w:t>I'm not making this Covenant and its oath with you alone, but with you who are standing with us here today in the Presence of God, our God, and also with those who are not here with us today. You know what it was like in Egypt and how we crossed through the nations. You experienced their heartless gods, their idols of wood and stone, of silver and gold. Don't let down your guard lest even now, today, someone—man or woman, clan or tribe—gets sidetracked from God, our God, and gets involved with those pagan gods, lest some poisonous weed sprout and spread among you, a person who hears the words of the Covenant-oath and invites himself to the party, congratulating himself, 'I'm one of the good guys—nothing bad is going to happen to me!' But that kind of self-deception ends up ruining life for everybody. God will not let him off the hook. God's anger and jealousy will erupt like a volcano against that person. The curses written in this book will bury him. God will blot out his name from the records. God will separate him out from all the tribes of Israel for special punishment, according to all the curses of the Covenant written in this Book of the Revelation.</w:t>
             </w:r>
           </w:p>
         </w:tc>

</xml_diff>

<commit_message>
Deuteronomy 배지 정밀화 (OT 전수조사): 14문단 (EN+KO 28건) — ch28/ch31/ch33 과장 배지 절별 분리. Leviticus는 검증만 0건. 독스 34/34 export-back OK.
</commit_message>
<xml_diff>
--- a/gdocs_build/Deuteronomy.docx
+++ b/gdocs_build/Deuteronomy.docx
@@ -25708,7 +25708,7 @@
                 <w:b/>
                 <w:sz w:val="16"/>
               </w:rPr>
-              <w:t>1-6</w:t>
+              <w:t>1</w:t>
             </w:r>
           </w:p>
           <w:p>
@@ -25739,7 +25739,7 @@
                 <w:b/>
                 <w:sz w:val="16"/>
               </w:rPr>
-              <w:t>1-6</w:t>
+              <w:t>1</w:t>
             </w:r>
           </w:p>
           <w:p>
@@ -25762,7 +25762,7 @@
                 <w:b/>
                 <w:sz w:val="16"/>
               </w:rPr>
-              <w:t>1-6</w:t>
+              <w:t>1</w:t>
             </w:r>
           </w:p>
           <w:p>
@@ -25787,7 +25787,7 @@
                 <w:b/>
                 <w:sz w:val="16"/>
               </w:rPr>
-              <w:t>1-6</w:t>
+              <w:t>2</w:t>
             </w:r>
           </w:p>
           <w:p>
@@ -25810,7 +25810,7 @@
                 <w:b/>
                 <w:sz w:val="16"/>
               </w:rPr>
-              <w:t>1-6</w:t>
+              <w:t>2</w:t>
             </w:r>
           </w:p>
           <w:p>
@@ -25833,7 +25833,7 @@
                 <w:b/>
                 <w:sz w:val="16"/>
               </w:rPr>
-              <w:t>1-6</w:t>
+              <w:t>2</w:t>
             </w:r>
           </w:p>
           <w:p>
@@ -25858,7 +25858,7 @@
                 <w:b/>
                 <w:sz w:val="16"/>
               </w:rPr>
-              <w:t>1-6</w:t>
+              <w:t>3-6</w:t>
             </w:r>
           </w:p>
           <w:p>
@@ -25881,7 +25881,7 @@
                 <w:b/>
                 <w:sz w:val="16"/>
               </w:rPr>
-              <w:t>1-6</w:t>
+              <w:t>3-6</w:t>
             </w:r>
           </w:p>
           <w:p>
@@ -25904,7 +25904,7 @@
                 <w:b/>
                 <w:sz w:val="16"/>
               </w:rPr>
-              <w:t>1-6</w:t>
+              <w:t>3-6</w:t>
             </w:r>
           </w:p>
           <w:p>
@@ -26284,7 +26284,7 @@
                 <w:b/>
                 <w:sz w:val="16"/>
               </w:rPr>
-              <w:t>15-19</w:t>
+              <w:t>15</w:t>
             </w:r>
           </w:p>
           <w:p>
@@ -26315,7 +26315,7 @@
                 <w:b/>
                 <w:sz w:val="16"/>
               </w:rPr>
-              <w:t>15-19</w:t>
+              <w:t>15</w:t>
             </w:r>
           </w:p>
           <w:p>
@@ -26338,7 +26338,7 @@
                 <w:b/>
                 <w:sz w:val="16"/>
               </w:rPr>
-              <w:t>15-19</w:t>
+              <w:t>15</w:t>
             </w:r>
           </w:p>
           <w:p>
@@ -26363,7 +26363,7 @@
                 <w:b/>
                 <w:sz w:val="16"/>
               </w:rPr>
-              <w:t>15-19</w:t>
+              <w:t>16-19</w:t>
             </w:r>
           </w:p>
           <w:p>
@@ -26386,7 +26386,7 @@
                 <w:b/>
                 <w:sz w:val="16"/>
               </w:rPr>
-              <w:t>15-19</w:t>
+              <w:t>16-19</w:t>
             </w:r>
           </w:p>
           <w:p>
@@ -26409,7 +26409,7 @@
                 <w:b/>
                 <w:sz w:val="16"/>
               </w:rPr>
-              <w:t>15-19</w:t>
+              <w:t>16-19</w:t>
             </w:r>
           </w:p>
           <w:p>
@@ -29972,7 +29972,7 @@
                 <w:b/>
                 <w:sz w:val="16"/>
               </w:rPr>
-              <w:t>14-15</w:t>
+              <w:t>14</w:t>
             </w:r>
           </w:p>
           <w:p>
@@ -30003,7 +30003,7 @@
                 <w:b/>
                 <w:sz w:val="16"/>
               </w:rPr>
-              <w:t>14-15</w:t>
+              <w:t>14</w:t>
             </w:r>
           </w:p>
           <w:p>
@@ -30026,7 +30026,7 @@
                 <w:b/>
                 <w:sz w:val="16"/>
               </w:rPr>
-              <w:t>14-15</w:t>
+              <w:t>14</w:t>
             </w:r>
           </w:p>
           <w:p>
@@ -30051,7 +30051,7 @@
                 <w:b/>
                 <w:sz w:val="16"/>
               </w:rPr>
-              <w:t>14-15</w:t>
+              <w:t>15</w:t>
             </w:r>
           </w:p>
           <w:p>
@@ -30074,7 +30074,7 @@
                 <w:b/>
                 <w:sz w:val="16"/>
               </w:rPr>
-              <w:t>14-15</w:t>
+              <w:t>15</w:t>
             </w:r>
           </w:p>
           <w:p>
@@ -30097,7 +30097,7 @@
                 <w:b/>
                 <w:sz w:val="16"/>
               </w:rPr>
-              <w:t>14-15</w:t>
+              <w:t>15</w:t>
             </w:r>
           </w:p>
           <w:p>
@@ -31818,7 +31818,7 @@
                 <w:b/>
                 <w:sz w:val="16"/>
               </w:rPr>
-              <w:t>1-5</w:t>
+              <w:t>1</w:t>
             </w:r>
           </w:p>
           <w:p>
@@ -31849,7 +31849,7 @@
                 <w:b/>
                 <w:sz w:val="16"/>
               </w:rPr>
-              <w:t>1-5</w:t>
+              <w:t>1</w:t>
             </w:r>
           </w:p>
           <w:p>
@@ -31872,7 +31872,7 @@
                 <w:b/>
                 <w:sz w:val="16"/>
               </w:rPr>
-              <w:t>1-5</w:t>
+              <w:t>1</w:t>
             </w:r>
           </w:p>
           <w:p>
@@ -31897,7 +31897,7 @@
                 <w:b/>
                 <w:sz w:val="16"/>
               </w:rPr>
-              <w:t>1-5</w:t>
+              <w:t>2-5</w:t>
             </w:r>
           </w:p>
           <w:p>
@@ -31920,7 +31920,7 @@
                 <w:b/>
                 <w:sz w:val="16"/>
               </w:rPr>
-              <w:t>1-5</w:t>
+              <w:t>2-5</w:t>
             </w:r>
           </w:p>
           <w:p>
@@ -31943,7 +31943,7 @@
                 <w:b/>
                 <w:sz w:val="16"/>
               </w:rPr>
-              <w:t>1-5</w:t>
+              <w:t>2-5</w:t>
             </w:r>
           </w:p>
           <w:p>
@@ -32268,7 +32268,7 @@
                 <w:b/>
                 <w:sz w:val="16"/>
               </w:rPr>
-              <w:t>8-11</w:t>
+              <w:t>8</w:t>
             </w:r>
           </w:p>
           <w:p>
@@ -32299,7 +32299,7 @@
                 <w:b/>
                 <w:sz w:val="16"/>
               </w:rPr>
-              <w:t>8-11</w:t>
+              <w:t>8</w:t>
             </w:r>
           </w:p>
           <w:p>
@@ -32322,7 +32322,7 @@
                 <w:b/>
                 <w:sz w:val="16"/>
               </w:rPr>
-              <w:t>8-11</w:t>
+              <w:t>8</w:t>
             </w:r>
           </w:p>
           <w:p>
@@ -32568,7 +32568,7 @@
                 <w:b/>
                 <w:sz w:val="16"/>
               </w:rPr>
-              <w:t>13-17</w:t>
+              <w:t>13</w:t>
             </w:r>
           </w:p>
           <w:p>
@@ -32599,7 +32599,7 @@
                 <w:b/>
                 <w:sz w:val="16"/>
               </w:rPr>
-              <w:t>13-17</w:t>
+              <w:t>13</w:t>
             </w:r>
           </w:p>
           <w:p>
@@ -32622,7 +32622,7 @@
                 <w:b/>
                 <w:sz w:val="16"/>
               </w:rPr>
-              <w:t>13-17</w:t>
+              <w:t>13</w:t>
             </w:r>
           </w:p>
           <w:p>
@@ -32718,7 +32718,7 @@
                 <w:b/>
                 <w:sz w:val="16"/>
               </w:rPr>
-              <w:t>18-19</w:t>
+              <w:t>18</w:t>
             </w:r>
           </w:p>
           <w:p>
@@ -32749,7 +32749,7 @@
                 <w:b/>
                 <w:sz w:val="16"/>
               </w:rPr>
-              <w:t>18-19</w:t>
+              <w:t>18</w:t>
             </w:r>
           </w:p>
           <w:p>
@@ -32772,7 +32772,7 @@
                 <w:b/>
                 <w:sz w:val="16"/>
               </w:rPr>
-              <w:t>18-19</w:t>
+              <w:t>18</w:t>
             </w:r>
           </w:p>
           <w:p>
@@ -32868,7 +32868,7 @@
                 <w:b/>
                 <w:sz w:val="16"/>
               </w:rPr>
-              <w:t>20-21</w:t>
+              <w:t>20</w:t>
             </w:r>
           </w:p>
           <w:p>
@@ -32899,7 +32899,7 @@
                 <w:b/>
                 <w:sz w:val="16"/>
               </w:rPr>
-              <w:t>20-21</w:t>
+              <w:t>20</w:t>
             </w:r>
           </w:p>
           <w:p>
@@ -32922,7 +32922,7 @@
                 <w:b/>
                 <w:sz w:val="16"/>
               </w:rPr>
-              <w:t>20-21</w:t>
+              <w:t>20</w:t>
             </w:r>
           </w:p>
           <w:p>
@@ -33318,7 +33318,7 @@
                 <w:b/>
                 <w:sz w:val="16"/>
               </w:rPr>
-              <w:t>24-25</w:t>
+              <w:t>24</w:t>
             </w:r>
           </w:p>
           <w:p>
@@ -33349,7 +33349,7 @@
                 <w:b/>
                 <w:sz w:val="16"/>
               </w:rPr>
-              <w:t>24-25</w:t>
+              <w:t>24</w:t>
             </w:r>
           </w:p>
           <w:p>
@@ -33372,7 +33372,7 @@
                 <w:b/>
                 <w:sz w:val="16"/>
               </w:rPr>
-              <w:t>24-25</w:t>
+              <w:t>24</w:t>
             </w:r>
           </w:p>
           <w:p>

</xml_diff>